<commit_message>
Adjust the report results
</commit_message>
<xml_diff>
--- a/Phiếu phân công nhiệm vụ 2.docx
+++ b/Phiếu phân công nhiệm vụ 2.docx
@@ -1075,10 +1075,18 @@
           <w:p>
             <w:pPr>
               <w:spacing w:before="60" w:after="60" w:line="26" w:lineRule="atLeast"/>
-              <w:rPr>
-                <w:lang w:val="vi-VN"/>
-              </w:rPr>
-            </w:pPr>
+            </w:pPr>
+            <w:r>
+              <w:t xml:space="preserve">Hoàn </w:t>
+            </w:r>
+            <w:proofErr w:type="spellStart"/>
+            <w:r>
+              <w:t>thành</w:t>
+            </w:r>
+            <w:proofErr w:type="spellEnd"/>
+            <w:r>
+              <w:t xml:space="preserve"> 100%</w:t>
+            </w:r>
           </w:p>
         </w:tc>
         <w:tc>
@@ -1169,6 +1177,17 @@
                 <w:lang w:val="vi-VN"/>
               </w:rPr>
             </w:pPr>
+            <w:r>
+              <w:t xml:space="preserve">Hoàn </w:t>
+            </w:r>
+            <w:proofErr w:type="spellStart"/>
+            <w:r>
+              <w:t>thành</w:t>
+            </w:r>
+            <w:proofErr w:type="spellEnd"/>
+            <w:r>
+              <w:t xml:space="preserve"> 100%</w:t>
+            </w:r>
           </w:p>
         </w:tc>
         <w:tc>
@@ -1259,6 +1278,17 @@
                 <w:lang w:val="vi-VN"/>
               </w:rPr>
             </w:pPr>
+            <w:r>
+              <w:t xml:space="preserve">Hoàn </w:t>
+            </w:r>
+            <w:proofErr w:type="spellStart"/>
+            <w:r>
+              <w:t>thành</w:t>
+            </w:r>
+            <w:proofErr w:type="spellEnd"/>
+            <w:r>
+              <w:t xml:space="preserve"> 100%</w:t>
+            </w:r>
           </w:p>
         </w:tc>
         <w:tc>
@@ -1349,6 +1379,17 @@
                 <w:lang w:val="vi-VN"/>
               </w:rPr>
             </w:pPr>
+            <w:r>
+              <w:t xml:space="preserve">Hoàn </w:t>
+            </w:r>
+            <w:proofErr w:type="spellStart"/>
+            <w:r>
+              <w:t>thành</w:t>
+            </w:r>
+            <w:proofErr w:type="spellEnd"/>
+            <w:r>
+              <w:t xml:space="preserve"> 100%</w:t>
+            </w:r>
           </w:p>
         </w:tc>
         <w:tc>
@@ -1439,6 +1480,17 @@
                 <w:lang w:val="vi-VN"/>
               </w:rPr>
             </w:pPr>
+            <w:r>
+              <w:t xml:space="preserve">Hoàn </w:t>
+            </w:r>
+            <w:proofErr w:type="spellStart"/>
+            <w:r>
+              <w:t>thành</w:t>
+            </w:r>
+            <w:proofErr w:type="spellEnd"/>
+            <w:r>
+              <w:t xml:space="preserve"> 100%</w:t>
+            </w:r>
           </w:p>
         </w:tc>
         <w:tc>
@@ -1535,6 +1587,20 @@
                 <w:lang w:val="vi-VN"/>
               </w:rPr>
             </w:pPr>
+            <w:r>
+              <w:t xml:space="preserve">Hoàn </w:t>
+            </w:r>
+            <w:proofErr w:type="spellStart"/>
+            <w:r>
+              <w:t>thành</w:t>
+            </w:r>
+            <w:proofErr w:type="spellEnd"/>
+            <w:r>
+              <w:t xml:space="preserve"> </w:t>
+            </w:r>
+            <w:r>
+              <w:t>90%</w:t>
+            </w:r>
           </w:p>
         </w:tc>
         <w:tc>
@@ -1625,6 +1691,17 @@
                 <w:lang w:val="vi-VN"/>
               </w:rPr>
             </w:pPr>
+            <w:r>
+              <w:t xml:space="preserve">Hoàn </w:t>
+            </w:r>
+            <w:proofErr w:type="spellStart"/>
+            <w:r>
+              <w:t>thành</w:t>
+            </w:r>
+            <w:proofErr w:type="spellEnd"/>
+            <w:r>
+              <w:t xml:space="preserve"> 90%</w:t>
+            </w:r>
           </w:p>
         </w:tc>
         <w:tc>
@@ -1715,6 +1792,17 @@
                 <w:lang w:val="vi-VN"/>
               </w:rPr>
             </w:pPr>
+            <w:r>
+              <w:t xml:space="preserve">Hoàn </w:t>
+            </w:r>
+            <w:proofErr w:type="spellStart"/>
+            <w:r>
+              <w:t>thành</w:t>
+            </w:r>
+            <w:proofErr w:type="spellEnd"/>
+            <w:r>
+              <w:t xml:space="preserve"> 90%</w:t>
+            </w:r>
           </w:p>
         </w:tc>
         <w:tc>
@@ -1802,6 +1890,17 @@
                 <w:lang w:val="vi-VN"/>
               </w:rPr>
             </w:pPr>
+            <w:r>
+              <w:t xml:space="preserve">Hoàn </w:t>
+            </w:r>
+            <w:proofErr w:type="spellStart"/>
+            <w:r>
+              <w:t>thành</w:t>
+            </w:r>
+            <w:proofErr w:type="spellEnd"/>
+            <w:r>
+              <w:t xml:space="preserve"> 90%</w:t>
+            </w:r>
           </w:p>
         </w:tc>
         <w:tc>
@@ -1892,6 +1991,17 @@
                 <w:lang w:val="vi-VN"/>
               </w:rPr>
             </w:pPr>
+            <w:r>
+              <w:t xml:space="preserve">Hoàn </w:t>
+            </w:r>
+            <w:proofErr w:type="spellStart"/>
+            <w:r>
+              <w:t>thành</w:t>
+            </w:r>
+            <w:proofErr w:type="spellEnd"/>
+            <w:r>
+              <w:t xml:space="preserve"> 90%</w:t>
+            </w:r>
           </w:p>
         </w:tc>
         <w:tc>

</xml_diff>